<commit_message>
Update workflow T-codes: YRVG005 (L1), YRVR005_A (L2), YRVR005_E (L3)
Co-Authored-By: Claude Opus 4.8 <noreply@anthropic.com>
Claude-Session: https://claude.ai/code/session_01A3BJ7ydDq6e8VDbD1uvXUk
</commit_message>
<xml_diff>
--- a/CIS_2026_27_Approval_Workflow.docx
+++ b/CIS_2026_27_Approval_Workflow.docx
@@ -1903,7 +1903,7 @@
                 <w:color w:val="FFFFFF"/>
                 <w:sz w:val="18"/>
               </w:rPr>
-              <w:t>Proposed T-code</w:t>
+              <w:t>T-code</w:t>
             </w:r>
           </w:p>
         </w:tc>
@@ -1967,7 +1967,7 @@
                 <w:b w:val="0"/>
                 <w:sz w:val="18"/>
               </w:rPr>
-              <w:t>YCIS_L1</w:t>
+              <w:t>YRVG005</w:t>
             </w:r>
           </w:p>
         </w:tc>
@@ -2032,7 +2032,7 @@
                 <w:b w:val="0"/>
                 <w:sz w:val="18"/>
               </w:rPr>
-              <w:t>YCIS_L2</w:t>
+              <w:t>YRVR005_A</w:t>
             </w:r>
           </w:p>
         </w:tc>
@@ -2095,7 +2095,7 @@
                 <w:b w:val="0"/>
                 <w:sz w:val="18"/>
               </w:rPr>
-              <w:t>YCIS_L3</w:t>
+              <w:t>YRVR005_E</w:t>
             </w:r>
           </w:p>
         </w:tc>
@@ -2177,7 +2177,7 @@
           <w:i w:val="0"/>
           <w:sz w:val="20"/>
         </w:rPr>
-        <w:t>Create the 3 transactions (SE93): YCIS_L1 → YRVG004_QAIS_EXECUTE_N1, YCIS_L2 → YCIS_APPROVE, YCIS_L3 → YCIS_EXECUTE.</w:t>
+        <w:t>Create the 3 transactions (SE93): YRVG005 → YRVG004_QAIS_EXECUTE_N1, YRVR005_A → YCIS_APPROVE, YRVR005_E → YCIS_EXECUTE.</w:t>
       </w:r>
     </w:p>
     <w:p>

</xml_diff>